<commit_message>
tambahan terintegrasi tte elektronik
</commit_message>
<xml_diff>
--- a/public/templates/template_undangan_l34.docx
+++ b/public/templates/template_undangan_l34.docx
@@ -307,14 +307,7 @@
                                     <w:color w:val="000000"/>
                                     <w:sz w:val="24"/>
                                   </w:rPr>
-                                  <w:t xml:space="preserve">Faksimil (022) 6649463 Website: bpsdm.jabarprov.go.id E-mail: </w:t>
-                                </w:r>
-                                <w:r>
-                                  <w:rPr>
-                                    <w:color w:val="000000"/>
-                                    <w:sz w:val="24"/>
-                                  </w:rPr>
-                                  <w:t>bpsdm@jabarprov.go.id</w:t>
+                                  <w:t>Faksimil (022) 6649463 Website: bpsdm.jabarprov.go.id E-mail: bpsdm@jabarprov.go.id</w:t>
                                 </w:r>
                               </w:p>
                               <w:p>
@@ -476,14 +469,7 @@
                               <w:color w:val="000000"/>
                               <w:sz w:val="24"/>
                             </w:rPr>
-                            <w:t xml:space="preserve">Faksimil (022) 6649463 Website: bpsdm.jabarprov.go.id E-mail: </w:t>
-                          </w:r>
-                          <w:r>
-                            <w:rPr>
-                              <w:color w:val="000000"/>
-                              <w:sz w:val="24"/>
-                            </w:rPr>
-                            <w:t>bpsdm@jabarprov.go.id</w:t>
+                            <w:t>Faksimil (022) 6649463 Website: bpsdm.jabarprov.go.id E-mail: bpsdm@jabarprov.go.id</w:t>
                           </w:r>
                         </w:p>
                         <w:p>
@@ -558,8 +544,8 @@
       <w:tblGrid>
         <w:gridCol w:w="1276"/>
         <w:gridCol w:w="284"/>
-        <w:gridCol w:w="4677"/>
-        <w:gridCol w:w="142"/>
+        <w:gridCol w:w="3969"/>
+        <w:gridCol w:w="850"/>
         <w:gridCol w:w="567"/>
         <w:gridCol w:w="3686"/>
       </w:tblGrid>
@@ -609,7 +595,7 @@
         </w:tc>
         <w:tc>
           <w:tcPr>
-            <w:tcW w:w="4677" w:type="dxa"/>
+            <w:tcW w:w="3969" w:type="dxa"/>
           </w:tcPr>
           <w:p>
             <w:pPr>
@@ -629,7 +615,7 @@
         </w:tc>
         <w:tc>
           <w:tcPr>
-            <w:tcW w:w="142" w:type="dxa"/>
+            <w:tcW w:w="850" w:type="dxa"/>
           </w:tcPr>
           <w:p>
             <w:pPr>
@@ -769,7 +755,7 @@
         </w:tc>
         <w:tc>
           <w:tcPr>
-            <w:tcW w:w="4677" w:type="dxa"/>
+            <w:tcW w:w="3969" w:type="dxa"/>
           </w:tcPr>
           <w:p>
             <w:pPr>
@@ -836,7 +822,7 @@
         </w:tc>
         <w:tc>
           <w:tcPr>
-            <w:tcW w:w="142" w:type="dxa"/>
+            <w:tcW w:w="850" w:type="dxa"/>
           </w:tcPr>
           <w:p>
             <w:pPr>
@@ -976,7 +962,7 @@
         </w:tc>
         <w:tc>
           <w:tcPr>
-            <w:tcW w:w="4677" w:type="dxa"/>
+            <w:tcW w:w="3969" w:type="dxa"/>
           </w:tcPr>
           <w:p>
             <w:pPr>
@@ -1007,7 +993,7 @@
         </w:tc>
         <w:tc>
           <w:tcPr>
-            <w:tcW w:w="142" w:type="dxa"/>
+            <w:tcW w:w="850" w:type="dxa"/>
           </w:tcPr>
           <w:p>
             <w:pPr>
@@ -1049,14 +1035,6 @@
                 <w:szCs w:val="24"/>
               </w:rPr>
             </w:pPr>
-            <w:r>
-              <w:rPr>
-                <w:color w:val="000000"/>
-                <w:sz w:val="24"/>
-                <w:szCs w:val="24"/>
-              </w:rPr>
-              <w:t>Yth.</w:t>
-            </w:r>
           </w:p>
         </w:tc>
         <w:tc>
@@ -1073,6 +1051,7 @@
                 <w:between w:val="nil"/>
               </w:pBdr>
               <w:spacing w:line="263" w:lineRule="auto"/>
+              <w:ind w:left="6"/>
               <w:rPr>
                 <w:color w:val="000000"/>
                 <w:sz w:val="24"/>
@@ -1086,6 +1065,23 @@
                 <w:szCs w:val="24"/>
               </w:rPr>
               <w:t xml:space="preserve">   </w:t>
+            </w:r>
+            <w:r>
+              <w:rPr>
+                <w:color w:val="000000"/>
+                <w:sz w:val="24"/>
+                <w:szCs w:val="24"/>
+              </w:rPr>
+              <w:t>Yth.</w:t>
+            </w:r>
+            <w:r>
+              <w:rPr>
+                <w:color w:val="000000"/>
+                <w:sz w:val="24"/>
+                <w:szCs w:val="24"/>
+                <w:lang w:val="id-ID"/>
+              </w:rPr>
+              <w:t xml:space="preserve"> </w:t>
             </w:r>
             <w:proofErr w:type="spellStart"/>
             <w:r>
@@ -1249,7 +1245,7 @@
         </w:tc>
         <w:tc>
           <w:tcPr>
-            <w:tcW w:w="4677" w:type="dxa"/>
+            <w:tcW w:w="3969" w:type="dxa"/>
           </w:tcPr>
           <w:p>
             <w:pPr>
@@ -1321,7 +1317,7 @@
         </w:tc>
         <w:tc>
           <w:tcPr>
-            <w:tcW w:w="142" w:type="dxa"/>
+            <w:tcW w:w="850" w:type="dxa"/>
           </w:tcPr>
           <w:p>
             <w:pPr>
@@ -1352,6 +1348,7 @@
                 <w:right w:val="nil"/>
                 <w:between w:val="nil"/>
               </w:pBdr>
+              <w:ind w:left="6"/>
               <w:rPr>
                 <w:rFonts w:ascii="Times New Roman" w:eastAsia="Times New Roman" w:hAnsi="Times New Roman" w:cs="Times New Roman"/>
                 <w:color w:val="000000"/>
@@ -1373,7 +1370,7 @@
                 <w:between w:val="nil"/>
               </w:pBdr>
               <w:spacing w:before="2"/>
-              <w:ind w:left="208"/>
+              <w:ind w:left="138"/>
               <w:rPr>
                 <w:color w:val="000000"/>
                 <w:sz w:val="24"/>
@@ -1461,7 +1458,7 @@
         </w:tc>
         <w:tc>
           <w:tcPr>
-            <w:tcW w:w="4677" w:type="dxa"/>
+            <w:tcW w:w="3969" w:type="dxa"/>
           </w:tcPr>
           <w:p>
             <w:pPr>
@@ -1503,7 +1500,7 @@
         </w:tc>
         <w:tc>
           <w:tcPr>
-            <w:tcW w:w="142" w:type="dxa"/>
+            <w:tcW w:w="850" w:type="dxa"/>
           </w:tcPr>
           <w:p>
             <w:pPr>
@@ -1514,6 +1511,7 @@
                 <w:right w:val="nil"/>
                 <w:between w:val="nil"/>
               </w:pBdr>
+              <w:ind w:left="-570"/>
               <w:rPr>
                 <w:rFonts w:ascii="Times New Roman" w:eastAsia="Times New Roman" w:hAnsi="Times New Roman" w:cs="Times New Roman"/>
                 <w:color w:val="000000"/>
@@ -1534,6 +1532,7 @@
                 <w:right w:val="nil"/>
                 <w:between w:val="nil"/>
               </w:pBdr>
+              <w:ind w:left="6"/>
               <w:rPr>
                 <w:rFonts w:ascii="Times New Roman" w:eastAsia="Times New Roman" w:hAnsi="Times New Roman" w:cs="Times New Roman"/>
                 <w:color w:val="000000"/>
@@ -1555,6 +1554,7 @@
                 <w:between w:val="nil"/>
               </w:pBdr>
               <w:spacing w:before="1" w:line="258" w:lineRule="auto"/>
+              <w:ind w:left="6"/>
               <w:rPr>
                 <w:color w:val="000000"/>
                 <w:sz w:val="24"/>
@@ -1588,6 +1588,7 @@
                 <w:between w:val="nil"/>
               </w:pBdr>
               <w:spacing w:before="1" w:line="258" w:lineRule="auto"/>
+              <w:ind w:left="6"/>
               <w:rPr>
                 <w:color w:val="000000"/>
                 <w:sz w:val="24"/>
@@ -1613,6 +1614,7 @@
                 <w:between w:val="nil"/>
               </w:pBdr>
               <w:spacing w:before="1" w:line="258" w:lineRule="auto"/>
+              <w:ind w:left="6"/>
               <w:rPr>
                 <w:color w:val="000000"/>
                 <w:sz w:val="24"/>
@@ -1995,7 +1997,24 @@
           <w:sz w:val="24"/>
           <w:szCs w:val="24"/>
         </w:rPr>
-        <w:t>Demikian disampaikan, atas perhatian dan kerjasamanya diucapkan terima kasih.</w:t>
+        <w:t>Demikian disampaikan, atas perhatian dan kerja</w:t>
+      </w:r>
+      <w:r>
+        <w:rPr>
+          <w:color w:val="000000"/>
+          <w:sz w:val="24"/>
+          <w:szCs w:val="24"/>
+          <w:lang w:val="id-ID"/>
+        </w:rPr>
+        <w:t xml:space="preserve"> </w:t>
+      </w:r>
+      <w:r>
+        <w:rPr>
+          <w:color w:val="000000"/>
+          <w:sz w:val="24"/>
+          <w:szCs w:val="24"/>
+        </w:rPr>
+        <w:t>samanya diucapkan terima kasih.</w:t>
       </w:r>
     </w:p>
     <w:p>
@@ -2054,15 +2073,7 @@
           <w:sz w:val="24"/>
           <w:szCs w:val="24"/>
         </w:rPr>
-        <w:t xml:space="preserve">KEPALA </w:t>
-      </w:r>
-      <w:r>
-        <w:rPr>
-          <w:color w:val="000000"/>
-          <w:sz w:val="24"/>
-          <w:szCs w:val="24"/>
-        </w:rPr>
-        <w:t>BADAN PENGEMBANGAN</w:t>
+        <w:t>KEPALA BADAN PENGEMBANGAN</w:t>
       </w:r>
     </w:p>
     <w:p>

</xml_diff>